<commit_message>
État du commit — 17 mars 2026 FormRecherchePublicSACEM.vb — 2083 lignes, 4 classes sacem_repertoire_public.py — 739 lignes Fonctionnalités validées dans cette session :
Recherche simple (phase 1) — grid peuplé d'un coup après toutes les requêtes
StatRecherche — N process --stat-seulement parallèles + MessageBox Oui/Non avant lancement
Multi-requêtes (+) — déduplication ISWC/titre, communs inter-requêtes corrects
Détails — tokens via stdin (plus de limite ligne de commande), buffer appliqué d'un coup
Colonnes : Titre | ISWC | Type | Durée | Interp | A | RE | C | E | SE | AR | AD | Sous-titres
Extraire rôles — CheckedListBox, titres associés par clic, "Appliquer sélection" → coches grid
Coche uniquement sur checkbox, texte sélectionnable, Ctrl+C
lblInfo : nb lignes / visibles / sélectionnées en temps réel
Communs = doublons requêtes 2+ uniquement (pas intra-SACEM)
</commit_message>
<xml_diff>
--- a/templates/CCDAA_template.docx
+++ b/templates/CCDAA_template.docx
@@ -13,10 +13,14 @@
         <w:spacing w:after="236" w:line="259" w:lineRule="auto"/>
         <w:ind w:left="267" w:right="257" w:firstLine="330"/>
         <w:jc w:val="center"/>
-      </w:pPr>
-      <w:r>
-        <w:rPr>
-          <w:b/>
+        <w:rPr>
+          <w:color w:val="auto"/>
+        </w:rPr>
+      </w:pPr>
+      <w:r>
+        <w:rPr>
+          <w:b/>
+          <w:color w:val="auto"/>
           <w:sz w:val="22"/>
           <w:szCs w:val="22"/>
         </w:rPr>
@@ -29,12 +33,14 @@
         <w:ind w:left="12"/>
         <w:rPr>
           <w:rFonts w:ascii="Cambria" w:eastAsia="Cambria" w:hAnsi="Cambria" w:cs="Cambria"/>
+          <w:color w:val="auto"/>
         </w:rPr>
       </w:pPr>
       <w:r>
         <w:rPr>
           <w:rFonts w:ascii="Cambria" w:eastAsia="Cambria" w:hAnsi="Cambria" w:cs="Cambria"/>
           <w:b/>
+          <w:color w:val="auto"/>
           <w:u w:val="single" w:color="000000"/>
         </w:rPr>
         <w:t>ENTRE :</w:t>
@@ -43,12 +49,14 @@
         <w:rPr>
           <w:rFonts w:ascii="Cambria" w:eastAsia="Cambria" w:hAnsi="Cambria" w:cs="Cambria"/>
           <w:b/>
+          <w:color w:val="auto"/>
         </w:rPr>
         <w:t xml:space="preserve">  </w:t>
       </w:r>
       <w:r>
         <w:rPr>
           <w:rFonts w:ascii="Cambria" w:eastAsia="Cambria" w:hAnsi="Cambria" w:cs="Cambria"/>
+          <w:color w:val="auto"/>
         </w:rPr>
         <w:t xml:space="preserve"> </w:t>
       </w:r>
@@ -60,13 +68,13 @@
         <w:jc w:val="left"/>
         <w:rPr>
           <w:rFonts w:ascii="Cambria" w:eastAsia="Cambria" w:hAnsi="Cambria" w:cs="Cambria"/>
-          <w:color w:val="FF0000"/>
+          <w:color w:val="auto"/>
         </w:rPr>
       </w:pPr>
       <w:r>
         <w:rPr>
           <w:rFonts w:ascii="Cambria" w:eastAsia="Cambria" w:hAnsi="Cambria" w:cs="Cambria"/>
-          <w:color w:val="FF0000"/>
+          <w:color w:val="auto"/>
         </w:rPr>
         <w:t>{</w:t>
       </w:r>
@@ -75,7 +83,7 @@
       <w:r>
         <w:rPr>
           <w:rFonts w:ascii="Cambria" w:eastAsia="Cambria" w:hAnsi="Cambria" w:cs="Cambria"/>
-          <w:color w:val="FF0000"/>
+          <w:color w:val="auto"/>
         </w:rPr>
         <w:t>auteurspart</w:t>
       </w:r>
@@ -84,7 +92,7 @@
       <w:r>
         <w:rPr>
           <w:rFonts w:ascii="Cambria" w:eastAsia="Cambria" w:hAnsi="Cambria" w:cs="Cambria"/>
-          <w:color w:val="FF0000"/>
+          <w:color w:val="auto"/>
         </w:rPr>
         <w:t>}</w:t>
       </w:r>
@@ -96,7 +104,7 @@
         <w:jc w:val="left"/>
         <w:rPr>
           <w:rFonts w:ascii="Cambria" w:eastAsia="Cambria" w:hAnsi="Cambria" w:cs="Cambria"/>
-          <w:color w:val="FF0000"/>
+          <w:color w:val="auto"/>
         </w:rPr>
       </w:pPr>
     </w:p>
@@ -171,12 +179,12 @@
         <w:ind w:left="0" w:firstLine="0"/>
         <w:jc w:val="left"/>
         <w:rPr>
-          <w:color w:val="FF0000"/>
-        </w:rPr>
-      </w:pPr>
-      <w:r>
-        <w:rPr>
-          <w:color w:val="FF0000"/>
+          <w:color w:val="auto"/>
+        </w:rPr>
+      </w:pPr>
+      <w:r>
+        <w:rPr>
+          <w:color w:val="auto"/>
         </w:rPr>
         <w:t>{</w:t>
       </w:r>
@@ -184,7 +192,7 @@
       <w:proofErr w:type="gramStart"/>
       <w:r>
         <w:rPr>
-          <w:color w:val="FF0000"/>
+          <w:color w:val="auto"/>
         </w:rPr>
         <w:t>editeurspart</w:t>
       </w:r>
@@ -192,7 +200,7 @@
       <w:proofErr w:type="gramEnd"/>
       <w:r>
         <w:rPr>
-          <w:color w:val="FF0000"/>
+          <w:color w:val="auto"/>
         </w:rPr>
         <w:t>}</w:t>
       </w:r>
@@ -202,10 +210,14 @@
         <w:spacing w:after="235" w:line="256" w:lineRule="auto"/>
         <w:ind w:left="10" w:right="15" w:hanging="8"/>
         <w:jc w:val="right"/>
+        <w:rPr>
+          <w:color w:val="auto"/>
+        </w:rPr>
       </w:pPr>
       <w:r>
         <w:rPr>
           <w:rFonts w:ascii="Cambria" w:eastAsia="Cambria" w:hAnsi="Cambria" w:cs="Cambria"/>
+          <w:color w:val="auto"/>
         </w:rPr>
         <w:t>Ci-après dénommé(e)(s) ensemble</w:t>
       </w:r>
@@ -213,6 +225,7 @@
         <w:rPr>
           <w:rFonts w:ascii="Cambria" w:eastAsia="Cambria" w:hAnsi="Cambria" w:cs="Cambria"/>
           <w:b/>
+          <w:color w:val="auto"/>
         </w:rPr>
         <w:t xml:space="preserve"> « ÉDITEUR », </w:t>
       </w:r>
@@ -222,10 +235,14 @@
         <w:spacing w:after="314" w:line="265" w:lineRule="auto"/>
         <w:ind w:left="10"/>
         <w:jc w:val="left"/>
-      </w:pPr>
-      <w:r>
-        <w:rPr>
-          <w:b/>
+        <w:rPr>
+          <w:color w:val="auto"/>
+        </w:rPr>
+      </w:pPr>
+      <w:r>
+        <w:rPr>
+          <w:b/>
+          <w:color w:val="auto"/>
           <w:u w:val="single"/>
         </w:rPr>
         <w:t>ÉTANT RAPPELÉ QUE :</w:t>
@@ -236,18 +253,28 @@
         <w:spacing w:line="273" w:lineRule="auto"/>
         <w:ind w:left="-5" w:firstLine="5"/>
         <w:jc w:val="left"/>
-      </w:pPr>
-      <w:r>
+        <w:rPr>
+          <w:color w:val="auto"/>
+        </w:rPr>
+      </w:pPr>
+      <w:r>
+        <w:rPr>
+          <w:color w:val="auto"/>
+        </w:rPr>
         <w:t xml:space="preserve">L’adaptation audiovisuelle d’une </w:t>
       </w:r>
       <w:r>
         <w:rPr>
           <w:b/>
           <w:bCs/>
+          <w:color w:val="auto"/>
         </w:rPr>
         <w:t>OEUVRE</w:t>
       </w:r>
       <w:r>
+        <w:rPr>
+          <w:color w:val="auto"/>
+        </w:rPr>
         <w:t xml:space="preserve"> musicale doit être la transposition en images de la musique, avec ou sans paroles, et non le simple fait de poser la musique, avec ou sans paroles, sur des images. Lorsque la musique est utilisée pour illustrer des images, c’est le droit dit dans les usages professionnels de “synchronisation”, distinct du droit d’adaptation audiovisuelle, qui doit s’appliquer.</w:t>
       </w:r>
     </w:p>
@@ -255,14 +282,20 @@
       <w:pPr>
         <w:spacing w:after="345"/>
         <w:ind w:left="10" w:right="27" w:firstLine="5"/>
-      </w:pPr>
-      <w:r>
+        <w:rPr>
+          <w:color w:val="auto"/>
+        </w:rPr>
+      </w:pPr>
+      <w:r>
+        <w:rPr>
+          <w:color w:val="auto"/>
+        </w:rPr>
         <w:t xml:space="preserve">Par contrat en date du </w:t>
       </w:r>
       <w:r>
         <w:rPr>
           <w:rFonts w:ascii="Cambria" w:eastAsia="Cambria" w:hAnsi="Cambria" w:cs="Cambria"/>
-          <w:color w:val="FF0000"/>
+          <w:color w:val="auto"/>
         </w:rPr>
         <w:t>[</w:t>
       </w:r>
@@ -271,7 +304,7 @@
       <w:r>
         <w:rPr>
           <w:rFonts w:ascii="Cambria" w:eastAsia="Cambria" w:hAnsi="Cambria" w:cs="Cambria"/>
-          <w:color w:val="FF0000"/>
+          <w:color w:val="auto"/>
         </w:rPr>
         <w:t>Faitle</w:t>
       </w:r>
@@ -279,18 +312,21 @@
       <w:r>
         <w:rPr>
           <w:rFonts w:ascii="Cambria" w:eastAsia="Cambria" w:hAnsi="Cambria" w:cs="Cambria"/>
-          <w:color w:val="FF0000"/>
+          <w:color w:val="auto"/>
         </w:rPr>
         <w:t xml:space="preserve">] </w:t>
       </w:r>
       <w:r>
         <w:rPr>
           <w:rFonts w:ascii="Cambria" w:eastAsia="Cambria" w:hAnsi="Cambria" w:cs="Cambria"/>
-          <w:color w:val="FF0000"/>
+          <w:color w:val="auto"/>
         </w:rPr>
         <w:t xml:space="preserve"> </w:t>
       </w:r>
       <w:r>
+        <w:rPr>
+          <w:color w:val="auto"/>
+        </w:rPr>
         <w:t>l’</w:t>
       </w:r>
       <w:r>
@@ -303,16 +339,23 @@
       </w:r>
       <w:proofErr w:type="gramEnd"/>
       <w:r>
+        <w:rPr>
+          <w:color w:val="auto"/>
+        </w:rPr>
         <w:t xml:space="preserve"> a cédé le droit exclusif d’imprimer, publier, reproduire et vendre l’</w:t>
       </w:r>
       <w:r>
         <w:rPr>
           <w:b/>
           <w:bCs/>
+          <w:color w:val="auto"/>
         </w:rPr>
         <w:t>OEUVRE</w:t>
       </w:r>
       <w:r>
+        <w:rPr>
+          <w:color w:val="auto"/>
+        </w:rPr>
         <w:t xml:space="preserve"> aux termes de ce contrat, l’éditeur s’est engagé à publier l’œuvre musical, à lui assurer une exploitation permanente et suivie, et à permettre par tous moyens appropriés sa promotion ; ainsi les contractants ont un intérêt commun à ce que l’œuvre éditée connaisse la plus large exploitation possible, notamment par voie d’adaptations audiovisuelles</w:t>
       </w:r>
     </w:p>
@@ -321,7 +364,7 @@
         <w:spacing w:after="44" w:line="273" w:lineRule="auto"/>
         <w:ind w:left="25" w:right="34" w:firstLine="5"/>
         <w:rPr>
-          <w:color w:val="FF0000"/>
+          <w:color w:val="auto"/>
         </w:rPr>
       </w:pPr>
       <w:r>
@@ -370,19 +413,16 @@
         <w:rPr>
           <w:color w:val="auto"/>
         </w:rPr>
-        <w:t>, qui certes ne dispose plus du droit d’adapter lui-même ou d’autoriser un tiers à adapter, mais qui pour autant reste titulaire du droit inaliénable de contrôler la mise en œuvre de l’adaptation et de s’y opposer le cas échéant</w:t>
-      </w:r>
-      <w:r>
-        <w:rPr>
-          <w:color w:val="FF0000"/>
-        </w:rPr>
-        <w:t>.</w:t>
+        <w:t>, qui certes ne dispose plus du droit d’adapter lui-même ou d’autoriser un tiers à adapter, mais qui pour autant reste titulaire du droit inaliénable de contrôler la mise en œuvre de l’adaptation et de s’y opposer le cas échéant.</w:t>
       </w:r>
     </w:p>
     <w:p>
       <w:pPr>
         <w:spacing w:after="44" w:line="273" w:lineRule="auto"/>
         <w:ind w:left="25" w:right="34" w:firstLine="5"/>
+        <w:rPr>
+          <w:color w:val="auto"/>
+        </w:rPr>
       </w:pPr>
     </w:p>
     <w:p>
@@ -395,14 +435,14 @@
         <w:jc w:val="center"/>
         <w:rPr>
           <w:i/>
-          <w:color w:val="FF0000"/>
+          <w:color w:val="auto"/>
           <w:u w:val="none"/>
         </w:rPr>
       </w:pPr>
       <w:r>
         <w:rPr>
           <w:iCs/>
-          <w:color w:val="FF0000"/>
+          <w:color w:val="auto"/>
           <w:u w:val="none"/>
         </w:rPr>
         <w:t>Titre</w:t>
@@ -410,7 +450,7 @@
       <w:r>
         <w:rPr>
           <w:i/>
-          <w:color w:val="FF0000"/>
+          <w:color w:val="auto"/>
           <w:u w:val="none"/>
         </w:rPr>
         <w:t xml:space="preserve"> : </w:t>
@@ -420,7 +460,7 @@
           <w:b w:val="0"/>
           <w:bCs/>
           <w:i/>
-          <w:color w:val="FF0000"/>
+          <w:color w:val="auto"/>
           <w:u w:val="none"/>
         </w:rPr>
         <w:t>[</w:t>
@@ -430,7 +470,7 @@
           <w:b w:val="0"/>
           <w:bCs/>
           <w:i/>
-          <w:color w:val="FF0000"/>
+          <w:color w:val="auto"/>
           <w:u w:val="none"/>
         </w:rPr>
         <w:t>Titre</w:t>
@@ -440,7 +480,7 @@
           <w:b w:val="0"/>
           <w:bCs/>
           <w:i/>
-          <w:color w:val="FF0000"/>
+          <w:color w:val="auto"/>
           <w:u w:val="none"/>
         </w:rPr>
         <w:t xml:space="preserve">]     </w:t>
@@ -451,13 +491,16 @@
         <w:spacing w:after="0"/>
         <w:ind w:left="11" w:right="43" w:hanging="11"/>
         <w:jc w:val="center"/>
+        <w:rPr>
+          <w:color w:val="auto"/>
+        </w:rPr>
       </w:pPr>
       <w:r>
         <w:rPr>
           <w:rFonts w:eastAsia="Cambria"/>
           <w:b/>
           <w:iCs/>
-          <w:color w:val="FF0000"/>
+          <w:color w:val="auto"/>
           <w:u w:color="FF0000"/>
         </w:rPr>
         <w:t>Paroles</w:t>
@@ -467,7 +510,7 @@
           <w:rFonts w:eastAsia="Cambria"/>
           <w:b/>
           <w:i/>
-          <w:color w:val="FF0000"/>
+          <w:color w:val="auto"/>
           <w:u w:color="FF0000"/>
         </w:rPr>
         <w:t xml:space="preserve"> :</w:t>
@@ -476,7 +519,7 @@
         <w:rPr>
           <w:rFonts w:eastAsia="Cambria"/>
           <w:i/>
-          <w:color w:val="FF0000"/>
+          <w:color w:val="auto"/>
         </w:rPr>
         <w:t xml:space="preserve"> </w:t>
       </w:r>
@@ -484,7 +527,7 @@
         <w:rPr>
           <w:rFonts w:eastAsia="Cambria"/>
           <w:i/>
-          <w:color w:val="FF0000"/>
+          <w:color w:val="auto"/>
         </w:rPr>
         <w:t>[</w:t>
       </w:r>
@@ -493,7 +536,7 @@
         <w:rPr>
           <w:rFonts w:eastAsia="Cambria"/>
           <w:i/>
-          <w:color w:val="FF0000"/>
+          <w:color w:val="auto"/>
         </w:rPr>
         <w:t>auteurslist</w:t>
       </w:r>
@@ -502,7 +545,7 @@
         <w:rPr>
           <w:rFonts w:eastAsia="Cambria"/>
           <w:i/>
-          <w:color w:val="FF0000"/>
+          <w:color w:val="auto"/>
         </w:rPr>
         <w:t>]</w:t>
       </w:r>
@@ -512,13 +555,16 @@
         <w:spacing w:after="46"/>
         <w:ind w:left="11" w:right="52" w:hanging="11"/>
         <w:jc w:val="center"/>
+        <w:rPr>
+          <w:color w:val="auto"/>
+        </w:rPr>
       </w:pPr>
       <w:r>
         <w:rPr>
           <w:rFonts w:eastAsia="Cambria"/>
           <w:b/>
           <w:iCs/>
-          <w:color w:val="FF0000"/>
+          <w:color w:val="auto"/>
           <w:u w:color="FF0000"/>
         </w:rPr>
         <w:t>Musique</w:t>
@@ -527,7 +573,7 @@
         <w:rPr>
           <w:rFonts w:eastAsia="Cambria"/>
           <w:i/>
-          <w:color w:val="FF0000"/>
+          <w:color w:val="auto"/>
           <w:u w:color="FF0000"/>
         </w:rPr>
         <w:t xml:space="preserve"> </w:t>
@@ -536,7 +582,7 @@
         <w:rPr>
           <w:rFonts w:eastAsia="Cambria"/>
           <w:i/>
-          <w:color w:val="FF0000"/>
+          <w:color w:val="auto"/>
         </w:rPr>
         <w:t xml:space="preserve">: </w:t>
       </w:r>
@@ -544,7 +590,7 @@
         <w:rPr>
           <w:rFonts w:eastAsia="Cambria"/>
           <w:i/>
-          <w:color w:val="FF0000"/>
+          <w:color w:val="auto"/>
         </w:rPr>
         <w:t>[</w:t>
       </w:r>
@@ -553,7 +599,7 @@
         <w:rPr>
           <w:rFonts w:eastAsia="Cambria"/>
           <w:i/>
-          <w:color w:val="FF0000"/>
+          <w:color w:val="auto"/>
         </w:rPr>
         <w:t>compositeurslist</w:t>
       </w:r>
@@ -562,7 +608,7 @@
         <w:rPr>
           <w:rFonts w:eastAsia="Cambria"/>
           <w:i/>
-          <w:color w:val="FF0000"/>
+          <w:color w:val="auto"/>
         </w:rPr>
         <w:t>]</w:t>
       </w:r>
@@ -574,7 +620,7 @@
         <w:rPr>
           <w:b/>
           <w:i/>
-          <w:color w:val="FF0000"/>
+          <w:color w:val="auto"/>
         </w:rPr>
       </w:pPr>
       <w:r>
@@ -582,7 +628,7 @@
           <w:rFonts w:eastAsia="Cambria"/>
           <w:b/>
           <w:iCs/>
-          <w:color w:val="FF0000"/>
+          <w:color w:val="auto"/>
           <w:u w:color="FF0000"/>
         </w:rPr>
         <w:t>Durée</w:t>
@@ -592,7 +638,7 @@
           <w:rFonts w:eastAsia="Cambria"/>
           <w:b/>
           <w:i/>
-          <w:color w:val="FF0000"/>
+          <w:color w:val="auto"/>
           <w:u w:color="FF0000"/>
         </w:rPr>
         <w:t xml:space="preserve"> : </w:t>
@@ -601,7 +647,7 @@
         <w:rPr>
           <w:rFonts w:eastAsia="Cambria"/>
           <w:i/>
-          <w:color w:val="FF0000"/>
+          <w:color w:val="auto"/>
         </w:rPr>
         <w:t>[</w:t>
       </w:r>
@@ -609,7 +655,7 @@
         <w:rPr>
           <w:rFonts w:eastAsia="Cambria"/>
           <w:i/>
-          <w:color w:val="FF0000"/>
+          <w:color w:val="auto"/>
         </w:rPr>
         <w:t>Duree</w:t>
       </w:r>
@@ -617,7 +663,7 @@
         <w:rPr>
           <w:rFonts w:eastAsia="Cambria"/>
           <w:i/>
-          <w:color w:val="FF0000"/>
+          <w:color w:val="auto"/>
         </w:rPr>
         <w:t>]</w:t>
       </w:r>
@@ -625,26 +671,40 @@
     <w:p>
       <w:pPr>
         <w:ind w:left="10" w:right="27" w:firstLine="5"/>
-      </w:pPr>
-      <w:r>
+        <w:rPr>
+          <w:color w:val="auto"/>
+        </w:rPr>
+      </w:pPr>
+      <w:r>
+        <w:rPr>
+          <w:color w:val="auto"/>
+        </w:rPr>
         <w:t>Ainsi que sur son titre, ci-après l’</w:t>
       </w:r>
       <w:r>
         <w:rPr>
           <w:b/>
+          <w:color w:val="auto"/>
         </w:rPr>
         <w:t>ŒUVRE</w:t>
       </w:r>
       <w:r>
+        <w:rPr>
+          <w:color w:val="auto"/>
+        </w:rPr>
         <w:t>, sans préjudice des droits apportés par l’</w:t>
       </w:r>
       <w:r>
         <w:rPr>
           <w:b/>
+          <w:color w:val="auto"/>
         </w:rPr>
         <w:t xml:space="preserve">AUTEUR </w:t>
       </w:r>
       <w:r>
+        <w:rPr>
+          <w:color w:val="auto"/>
+        </w:rPr>
         <w:t>aux organismes de gestion des droits d’auteur et à l'exclusion du droit moral.</w:t>
       </w:r>
     </w:p>
@@ -653,10 +713,14 @@
         <w:spacing w:after="258" w:line="259" w:lineRule="auto"/>
         <w:ind w:left="25" w:firstLine="5"/>
         <w:jc w:val="left"/>
-      </w:pPr>
-      <w:r>
-        <w:rPr>
-          <w:b/>
+        <w:rPr>
+          <w:color w:val="auto"/>
+        </w:rPr>
+      </w:pPr>
+      <w:r>
+        <w:rPr>
+          <w:b/>
+          <w:color w:val="auto"/>
         </w:rPr>
         <w:t>IL EST CONVENU CE QUI SUIT :</w:t>
       </w:r>
@@ -664,159 +728,233 @@
     <w:p>
       <w:pPr>
         <w:ind w:left="10" w:right="27" w:firstLine="5"/>
-      </w:pPr>
-      <w:r>
-        <w:rPr>
-          <w:b/>
+        <w:rPr>
+          <w:color w:val="auto"/>
+        </w:rPr>
+      </w:pPr>
+      <w:r>
+        <w:rPr>
+          <w:b/>
+          <w:color w:val="auto"/>
           <w:u w:val="single"/>
         </w:rPr>
         <w:t xml:space="preserve">ARTICLE 1 - </w:t>
       </w:r>
       <w:r>
+        <w:rPr>
+          <w:color w:val="auto"/>
+        </w:rPr>
         <w:t>Vu les dispositions du Code de la propriété intellectuelle en vigueur à ce jour, en particulier son article L.131-3, et du Code des usages et des bonnes pratiques de l'édition des œuvres musicales dans sa version signée le 4 octobre 2017, le présent contrat a pour objet la cession, à titre exclusif, à l'</w:t>
       </w:r>
       <w:r>
         <w:rPr>
           <w:b/>
+          <w:color w:val="auto"/>
         </w:rPr>
         <w:t xml:space="preserve">ÉDITEUR </w:t>
       </w:r>
       <w:r>
+        <w:rPr>
+          <w:color w:val="auto"/>
+        </w:rPr>
         <w:t>du droit d'adaptation audiovisuelle de l’</w:t>
       </w:r>
       <w:r>
         <w:rPr>
           <w:b/>
+          <w:color w:val="auto"/>
         </w:rPr>
         <w:t>ŒUVRE</w:t>
       </w:r>
       <w:r>
+        <w:rPr>
+          <w:color w:val="auto"/>
+        </w:rPr>
         <w:t>.</w:t>
       </w:r>
     </w:p>
     <w:p>
       <w:pPr>
         <w:ind w:left="10" w:right="27" w:firstLine="5"/>
-      </w:pPr>
-      <w:r>
-        <w:rPr>
-          <w:b/>
+        <w:rPr>
+          <w:color w:val="auto"/>
+        </w:rPr>
+      </w:pPr>
+      <w:r>
+        <w:rPr>
+          <w:b/>
+          <w:color w:val="auto"/>
           <w:u w:val="single"/>
         </w:rPr>
         <w:t xml:space="preserve">ARTICLE 2 - </w:t>
       </w:r>
       <w:r>
+        <w:rPr>
+          <w:color w:val="auto"/>
+        </w:rPr>
         <w:t>Une fois acquise l’autorisation écrite de l’</w:t>
       </w:r>
       <w:r>
         <w:rPr>
           <w:b/>
+          <w:color w:val="auto"/>
         </w:rPr>
         <w:t xml:space="preserve">AUTEUR </w:t>
       </w:r>
       <w:r>
+        <w:rPr>
+          <w:color w:val="auto"/>
+        </w:rPr>
         <w:t>au titre de son droit moral, l'</w:t>
       </w:r>
       <w:r>
         <w:rPr>
           <w:b/>
+          <w:color w:val="auto"/>
         </w:rPr>
         <w:t xml:space="preserve">ÉDITEUR </w:t>
       </w:r>
       <w:r>
+        <w:rPr>
+          <w:color w:val="auto"/>
+        </w:rPr>
         <w:t>aura donc le droit d’autoriser lui-même ou par tout tiers de son choix, l’adaptation audiovisuelle de l’</w:t>
       </w:r>
       <w:r>
         <w:rPr>
           <w:b/>
+          <w:color w:val="auto"/>
         </w:rPr>
         <w:t>ŒUVRE</w:t>
       </w:r>
       <w:r>
+        <w:rPr>
+          <w:color w:val="auto"/>
+        </w:rPr>
         <w:t>, avec ou sans paroles, dans son intégralité ou par extraits, ainsi que l’exploitation de l’adaptation audiovisuelle de l’</w:t>
       </w:r>
       <w:r>
         <w:rPr>
           <w:b/>
+          <w:color w:val="auto"/>
         </w:rPr>
         <w:t>ŒUVRE</w:t>
       </w:r>
       <w:r>
+        <w:rPr>
+          <w:color w:val="auto"/>
+        </w:rPr>
         <w:t>, des manières, fins, durée et territoires identiques à ceux visés au contrat de cession et d’édition précité, par tous procédés et moyens actuellement connus ainsi que par ceux qui seront découverts ou créés dans l'avenir.</w:t>
       </w:r>
     </w:p>
     <w:p>
       <w:pPr>
         <w:ind w:left="10" w:right="27" w:firstLine="5"/>
-      </w:pPr>
-      <w:r>
-        <w:rPr>
-          <w:b/>
+        <w:rPr>
+          <w:color w:val="auto"/>
+        </w:rPr>
+      </w:pPr>
+      <w:r>
+        <w:rPr>
+          <w:b/>
+          <w:color w:val="auto"/>
           <w:u w:val="single"/>
         </w:rPr>
         <w:t xml:space="preserve">ARTICLE 3 – </w:t>
       </w:r>
       <w:r>
+        <w:rPr>
+          <w:color w:val="auto"/>
+        </w:rPr>
         <w:t>La rémunération due à l’</w:t>
       </w:r>
       <w:r>
         <w:rPr>
           <w:b/>
+          <w:color w:val="auto"/>
         </w:rPr>
         <w:t xml:space="preserve">AUTEUR </w:t>
       </w:r>
       <w:r>
+        <w:rPr>
+          <w:color w:val="auto"/>
+        </w:rPr>
         <w:t>est celle prévue aux articles 11 (Rémunération par les organismes de gestion des droits d’auteur) et 12-1-2° (Rémunération par l’éditeur) du contrat de cession et d’édition précité. En cas de pluralité de l’</w:t>
       </w:r>
       <w:r>
         <w:rPr>
           <w:b/>
+          <w:color w:val="auto"/>
         </w:rPr>
         <w:t>AUTEUR</w:t>
       </w:r>
       <w:r>
+        <w:rPr>
+          <w:color w:val="auto"/>
+        </w:rPr>
         <w:t xml:space="preserve">, elle sera répartie entre les </w:t>
       </w:r>
       <w:r>
         <w:rPr>
           <w:b/>
+          <w:color w:val="auto"/>
         </w:rPr>
         <w:t xml:space="preserve">AUTEURS </w:t>
       </w:r>
       <w:r>
+        <w:rPr>
+          <w:color w:val="auto"/>
+        </w:rPr>
         <w:t>de l’</w:t>
       </w:r>
       <w:r>
         <w:rPr>
           <w:b/>
+          <w:color w:val="auto"/>
         </w:rPr>
         <w:t xml:space="preserve">ŒUVRE </w:t>
       </w:r>
       <w:r>
+        <w:rPr>
+          <w:color w:val="auto"/>
+        </w:rPr>
         <w:t>conformément aux stipulations de l’article 12-3° dudit contrat.</w:t>
       </w:r>
     </w:p>
     <w:p>
       <w:pPr>
         <w:ind w:left="10" w:right="27" w:firstLine="5"/>
-      </w:pPr>
-      <w:r>
+        <w:rPr>
+          <w:color w:val="auto"/>
+        </w:rPr>
+      </w:pPr>
+      <w:r>
+        <w:rPr>
+          <w:color w:val="auto"/>
+        </w:rPr>
         <w:t>Les stipulations des articles 13 (Reddition des comptes et paiement) et 14 (Contrôle des comptes) du contrat de cession et d’édition précité s’appliquent ici à l’identique.</w:t>
       </w:r>
     </w:p>
     <w:p>
       <w:pPr>
         <w:ind w:left="10" w:right="27"/>
-      </w:pPr>
-      <w:r>
-        <w:rPr>
-          <w:b/>
+        <w:rPr>
+          <w:color w:val="auto"/>
+        </w:rPr>
+      </w:pPr>
+      <w:r>
+        <w:rPr>
+          <w:b/>
+          <w:color w:val="auto"/>
           <w:u w:val="single"/>
         </w:rPr>
         <w:lastRenderedPageBreak/>
         <w:t xml:space="preserve">ARTICLE 4 – </w:t>
       </w:r>
       <w:r>
+        <w:rPr>
+          <w:color w:val="auto"/>
+        </w:rPr>
         <w:t>Les stipulations de l’article 16 (Stipulations diverses) du contrat de cession et d’édition précité s’appliquent ici à l’identique.</w:t>
       </w:r>
     </w:p>
@@ -826,14 +964,14 @@
         <w:ind w:left="0" w:right="120" w:firstLine="0"/>
         <w:rPr>
           <w:rFonts w:eastAsia="Cambria"/>
-          <w:color w:val="FF0000"/>
+          <w:color w:val="auto"/>
         </w:rPr>
       </w:pPr>
       <w:bookmarkStart w:id="0" w:name="_Hlk157196358"/>
       <w:r>
         <w:rPr>
           <w:rFonts w:eastAsia="Cambria"/>
-          <w:color w:val="FF0000"/>
+          <w:color w:val="auto"/>
         </w:rPr>
         <w:t>Fait à [</w:t>
       </w:r>
@@ -841,7 +979,7 @@
       <w:r>
         <w:rPr>
           <w:rFonts w:eastAsia="Cambria"/>
-          <w:color w:val="FF0000"/>
+          <w:color w:val="auto"/>
         </w:rPr>
         <w:t>Faita</w:t>
       </w:r>
@@ -849,7 +987,7 @@
       <w:r>
         <w:rPr>
           <w:rFonts w:eastAsia="Cambria"/>
-          <w:color w:val="FF0000"/>
+          <w:color w:val="auto"/>
         </w:rPr>
         <w:t>], le [</w:t>
       </w:r>
@@ -857,7 +995,7 @@
       <w:r>
         <w:rPr>
           <w:rFonts w:eastAsia="Cambria"/>
-          <w:color w:val="FF0000"/>
+          <w:color w:val="auto"/>
         </w:rPr>
         <w:t>Faitle</w:t>
       </w:r>
@@ -865,49 +1003,49 @@
       <w:r>
         <w:rPr>
           <w:rFonts w:eastAsia="Cambria"/>
-          <w:color w:val="FF0000"/>
+          <w:color w:val="auto"/>
         </w:rPr>
         <w:t>], avec effet au même jour, en un original numérique imprimable et non modifiable dans le cas de</w:t>
       </w:r>
       <w:r>
         <w:rPr>
           <w:rFonts w:eastAsia="Cambria"/>
-          <w:color w:val="FF0000"/>
+          <w:color w:val="auto"/>
         </w:rPr>
         <w:t xml:space="preserve">   </w:t>
       </w:r>
       <w:r>
         <w:rPr>
           <w:rFonts w:eastAsia="Cambria"/>
-          <w:color w:val="FF0000"/>
+          <w:color w:val="auto"/>
         </w:rPr>
         <w:t xml:space="preserve">signature électronique </w:t>
       </w:r>
       <w:r>
         <w:rPr>
           <w:rFonts w:eastAsia="Cambria"/>
-          <w:color w:val="FF0000"/>
+          <w:color w:val="auto"/>
         </w:rPr>
         <w:t>dont chaque</w:t>
       </w:r>
       <w:r>
         <w:rPr>
           <w:rFonts w:eastAsia="Cambria"/>
-          <w:color w:val="FF0000"/>
+          <w:color w:val="auto"/>
         </w:rPr>
         <w:t>,</w:t>
       </w:r>
       <w:r>
         <w:rPr>
           <w:rFonts w:eastAsia="Cambria"/>
-          <w:color w:val="FF0000"/>
+          <w:color w:val="auto"/>
         </w:rPr>
         <w:t xml:space="preserve"> partie dispose</w:t>
       </w:r>
       <w:r>
         <w:rPr>
           <w:rFonts w:eastAsia="Cambria"/>
-          <w:color w:val="FF0000"/>
+          <w:color w:val="auto"/>
         </w:rPr>
         <w:t>.</w:t>
       </w:r>
@@ -921,13 +1059,13 @@
         <w:jc w:val="center"/>
         <w:rPr>
           <w:rFonts w:eastAsia="Cambria"/>
-          <w:color w:val="FF0000"/>
+          <w:color w:val="auto"/>
         </w:rPr>
       </w:pPr>
       <w:r>
         <w:rPr>
           <w:rFonts w:eastAsia="Cambria"/>
-          <w:color w:val="FF0000"/>
+          <w:color w:val="auto"/>
         </w:rPr>
         <w:t>{</w:t>
       </w:r>
@@ -936,7 +1074,7 @@
       <w:r>
         <w:rPr>
           <w:rFonts w:eastAsia="Cambria"/>
-          <w:color w:val="FF0000"/>
+          <w:color w:val="auto"/>
         </w:rPr>
         <w:t>tabsignature</w:t>
       </w:r>
@@ -945,7 +1083,7 @@
       <w:r>
         <w:rPr>
           <w:rFonts w:eastAsia="Cambria"/>
-          <w:color w:val="FF0000"/>
+          <w:color w:val="auto"/>
         </w:rPr>
         <w:t>}</w:t>
       </w:r>
@@ -956,6 +1094,7 @@
         <w:ind w:left="141" w:right="120" w:hanging="113"/>
         <w:rPr>
           <w:rFonts w:eastAsia="Cambria"/>
+          <w:color w:val="auto"/>
         </w:rPr>
       </w:pPr>
     </w:p>

</xml_diff>